<commit_message>
Auto commit (2026-10-06 14:59) — 4 changes
Claude Code 세션 종료 시 자동 커밋.

Co-Authored-By: Claude <noreply@anthropic.com>
</commit_message>
<xml_diff>
--- a/projects/37_masked_duke/가면 뒤 괴물 대공님의 저주_작가 미팅 자료.docx
+++ b/projects/37_masked_duke/가면 뒤 괴물 대공님의 저주_작가 미팅 자료.docx
@@ -29,7 +29,7 @@
           <w:b w:val="0"/>
           <w:sz w:val="21"/>
         </w:rPr>
-        <w:t>원고의 큰 흐름은 그대로 갑니다. 이 자료에는 전체 구조에서 꼭 바꿔야 하는 것과 작가님이 정하실 것을 나눠 적었습니다. 세부 대사와 지문은 개고를 받은 뒤에 따로 말씀드리겠습니다.</w:t>
+        <w:t>원고의 큰 흐름은 그대로 갑니다. 이 자료에는 전체 구조에서 고칠 방향만 적었습니다. 세부 대사와 지문은 개고를 받은 뒤에 따로 말씀드리겠습니다.</w:t>
       </w:r>
     </w:p>
     <w:p>
@@ -120,22 +120,7 @@
           <w:b w:val="0"/>
           <w:sz w:val="21"/>
         </w:rPr>
-        <w:t>15~18화 약물 잔 장면에서 엘리는 원작에서 본 일을 미리 알고 움직이고, 네이슨은 사람들 앞에서 망신을 당합니다. 뒤에 나오는 장면들도 이렇게 가면 됩니다.</w:t>
-      </w:r>
-    </w:p>
-    <w:p>
-      <w:pPr>
-        <w:pStyle w:val="ListBullet"/>
-        <w:keepNext w:val="0"/>
-        <w:spacing w:after="60" w:before="0" w:line="336" w:lineRule="auto"/>
-      </w:pPr>
-      <w:r>
-        <w:rPr>
-          <w:rFonts w:ascii="맑은 고딕" w:hAnsi="맑은 고딕" w:eastAsia="맑은 고딕" w:cs="맑은 고딕"/>
-          <w:b w:val="0"/>
-          <w:sz w:val="21"/>
-        </w:rPr>
-        <w:t>41화 「족집게 신」, 42화 엘리가 네이슨에게 발을 거는 장면도 그대로 갑니다.</w:t>
+        <w:t>15~18화 약물 잔 장면은 이 작품 전체의 본보기입니다. 아래 3번에서 다시 말씀드리겠습니다.</w:t>
       </w:r>
     </w:p>
     <w:p>
@@ -181,23 +166,7 @@
           <w:color w:val="1F3A5F"/>
           <w:sz w:val="26"/>
         </w:rPr>
-        <w:t>2. 꼭 바꿔야 하는 것</w:t>
-      </w:r>
-    </w:p>
-    <w:p>
-      <w:pPr>
-        <w:pStyle w:val="Heading3"/>
-        <w:keepNext/>
-        <w:spacing w:before="200" w:after="60"/>
-      </w:pPr>
-      <w:r>
-        <w:rPr>
-          <w:rFonts w:ascii="맑은 고딕" w:hAnsi="맑은 고딕" w:eastAsia="맑은 고딕" w:cs="맑은 고딕"/>
-          <w:b/>
-          <w:color w:val="1F3A5F"/>
-          <w:sz w:val="23"/>
-        </w:rPr>
-        <w:t>① 무료 1~10화를 러프 기획안대로 다시 짭니다 (첨부 참고)</w:t>
+        <w:t>2. 무료 1~10화는 러프 기획안대로 다시 짭니다 (첨부 참고)</w:t>
       </w:r>
     </w:p>
     <w:p>
@@ -305,60 +274,18 @@
     </w:p>
     <w:p>
       <w:pPr>
-        <w:pStyle w:val="Heading3"/>
+        <w:pStyle w:val="Heading2"/>
         <w:keepNext/>
-        <w:spacing w:before="200" w:after="60"/>
+        <w:spacing w:before="320" w:after="80"/>
       </w:pPr>
       <w:r>
         <w:rPr>
           <w:rFonts w:ascii="맑은 고딕" w:hAnsi="맑은 고딕" w:eastAsia="맑은 고딕" w:cs="맑은 고딕"/>
           <w:b/>
           <w:color w:val="1F3A5F"/>
-          <w:sz w:val="23"/>
+          <w:sz w:val="26"/>
         </w:rPr>
-        <w:t>② 엘리는 끝까지 원작을 압니다</w:t>
-      </w:r>
-    </w:p>
-    <w:p>
-      <w:pPr>
-        <w:keepNext w:val="0"/>
-        <w:spacing w:after="120" w:before="0" w:line="348" w:lineRule="auto"/>
-      </w:pPr>
-      <w:r>
-        <w:rPr>
-          <w:rFonts w:ascii="맑은 고딕" w:hAnsi="맑은 고딕" w:eastAsia="맑은 고딕" w:cs="맑은 고딕"/>
-          <w:b w:val="0"/>
-          <w:sz w:val="21"/>
-        </w:rPr>
-        <w:t>지금 원고에서는 엘리가 다음에 무슨 일이 생길지 모르고 당하는 장면이 여럿 있습니다. 20화에 성기사들에게 끌려갈 뻔하고, 29화에 비비안의 독칼을 보고 얼어붙고, 38~40화에는 흑마법사에게 납치됩니다. 25화에는 엘리가 직접 「아마 이제 내가 예측할 수 없는 방향으로 사건이 흐르겠지.」라고 말해서, 이때부터 엘리는 원작을 모르는 사람이 됩니다. 이 대사는 빼 주세요. 그리고 40화에 사슬을 끊는 힘과 47화 「주인공 버프」는 엘리가 아는 것에서 나오지 않고 신에게서 받습니다. 47화에 엘리가 킬리언 앞을 막아서는 건 좋습니다.</w:t>
-      </w:r>
-    </w:p>
-    <w:p>
-      <w:pPr>
-        <w:keepNext w:val="0"/>
-        <w:spacing w:after="120" w:before="0" w:line="348" w:lineRule="auto"/>
-      </w:pPr>
-      <w:r>
-        <w:rPr>
-          <w:rFonts w:ascii="맑은 고딕" w:hAnsi="맑은 고딕" w:eastAsia="맑은 고딕" w:cs="맑은 고딕"/>
-          <w:b w:val="0"/>
-          <w:sz w:val="21"/>
-        </w:rPr>
-        <w:t>사건은 그대로 두셔도 됩니다. 엘리가 모르고 당하는 장면만, 엘리가 원작에서 미리 보고 알고 들어가는 장면으로 바꿔 주세요. 마지막에 이기는 것도 엘리가 아는 것으로 이기게 해 주세요. 41화에서 엘리는 킬리언의 아버지를 죽인 저주가 황제와 흑마법사의 짓이라는 걸 이미 압니다. 이 비밀을 결말에 쓰시면 됩니다.</w:t>
-      </w:r>
-    </w:p>
-    <w:p>
-      <w:pPr>
-        <w:keepNext w:val="0"/>
-        <w:spacing w:after="120" w:before="0" w:line="348" w:lineRule="auto"/>
-      </w:pPr>
-      <w:r>
-        <w:rPr>
-          <w:rFonts w:ascii="맑은 고딕" w:hAnsi="맑은 고딕" w:eastAsia="맑은 고딕" w:cs="맑은 고딕"/>
-          <w:b w:val="0"/>
-          <w:sz w:val="21"/>
-        </w:rPr>
-        <w:t>이 작품은 원작을 다 아는 엘리가 답답하게 당하지 않고 시원하게 이기는 이야기로 소개됩니다. 후반에 엘리가 모르고 당하거나 받은 힘으로 이기면, 시청자가 처음부터 기대한 재미가 결말에서 빠집니다.</w:t>
+        <w:t>3. 전체를 고치는 방향 네 가지</w:t>
       </w:r>
     </w:p>
     <w:p>
@@ -374,7 +301,7 @@
           <w:color w:val="1F3A5F"/>
           <w:sz w:val="23"/>
         </w:rPr>
-        <w:t>③ 저주가 완전히 풀리는 순간을 보여 주세요</w:t>
+        <w:t>① 10분쯤 줄이고, 대사 수를 줄여 주세요</w:t>
       </w:r>
     </w:p>
     <w:p>
@@ -388,7 +315,7 @@
           <w:b w:val="0"/>
           <w:sz w:val="21"/>
         </w:rPr>
-        <w:t>2화에서 「첫 키스를 한 상대와 진정한 사랑에 빠져야 킬리언의 저주가 풀린다」고 정해 두셨습니다. 33·34화와 38화에서도 인물들이 저주가 완전히 풀리면 어떻게 되는지를 이야기합니다. 그런데 저주가 풀리는 순간은 화면에 나오지 않고, 44화에서 킬리언이 「내 저주는 이미 너로 인해 풀렸으니까.」라고 말하며 지나갑니다.</w:t>
+        <w:t>지금 원고는 약 75분이고, 대사가 약 620번 오갑니다. 무료에 장면이 붙으면 약 79분이 됩니다. 65분 안팎, 대사 450~500번이 목표입니다.</w:t>
       </w:r>
     </w:p>
     <w:p>
@@ -402,7 +329,467 @@
           <w:b w:val="0"/>
           <w:sz w:val="21"/>
         </w:rPr>
-        <w:t>검은 마력이 완전히 걷히는 순간을 한 장면으로 보여 주세요. 2화에서 정한 대로라면, 이 장면을 보고 시청자는 두 사람이 진짜로 사랑한다는 걸 압니다. 몇 화에 둘지는 작가님이 정해 주세요.</w:t>
+        <w:t>이 세 덩어리를 줄이면 약 15분이 빠집니다.</w:t>
+      </w:r>
+    </w:p>
+    <w:p>
+      <w:pPr>
+        <w:pStyle w:val="ListBullet"/>
+        <w:keepNext w:val="0"/>
+        <w:spacing w:after="60" w:before="0" w:line="336" w:lineRule="auto"/>
+      </w:pPr>
+      <w:r>
+        <w:rPr>
+          <w:rFonts w:ascii="맑은 고딕" w:hAnsi="맑은 고딕" w:eastAsia="맑은 고딕" w:cs="맑은 고딕"/>
+          <w:b w:val="0"/>
+          <w:sz w:val="21"/>
+        </w:rPr>
+        <w:t>26~31화 사냥대회 (약 9분 → 3~4분): 로젤린이 킬리언을 구할 수 있는 건 자기뿐이라고 나섰다가 망신당하는 부분만 남깁니다.</w:t>
+      </w:r>
+    </w:p>
+    <w:p>
+      <w:pPr>
+        <w:pStyle w:val="ListBullet"/>
+        <w:keepNext w:val="0"/>
+        <w:spacing w:after="60" w:before="0" w:line="336" w:lineRule="auto"/>
+      </w:pPr>
+      <w:r>
+        <w:rPr>
+          <w:rFonts w:ascii="맑은 고딕" w:hAnsi="맑은 고딕" w:eastAsia="맑은 고딕" w:cs="맑은 고딕"/>
+          <w:b w:val="0"/>
+          <w:sz w:val="21"/>
+        </w:rPr>
+        <w:t>38~42화 납치와 구출 (약 7분 → 2~3분)</w:t>
+      </w:r>
+    </w:p>
+    <w:p>
+      <w:pPr>
+        <w:pStyle w:val="ListBullet"/>
+        <w:keepNext w:val="0"/>
+        <w:spacing w:after="60" w:before="0" w:line="336" w:lineRule="auto"/>
+      </w:pPr>
+      <w:r>
+        <w:rPr>
+          <w:rFonts w:ascii="맑은 고딕" w:hAnsi="맑은 고딕" w:eastAsia="맑은 고딕" w:cs="맑은 고딕"/>
+          <w:b w:val="0"/>
+          <w:sz w:val="21"/>
+        </w:rPr>
+        <w:t>43~48화 기사단 진격, 황좌 탈환, 괴수 싸움 (약 9분 → 4분)</w:t>
+      </w:r>
+    </w:p>
+    <w:p>
+      <w:pPr>
+        <w:keepNext w:val="0"/>
+        <w:spacing w:after="120" w:before="0" w:line="348" w:lineRule="auto"/>
+      </w:pPr>
+      <w:r>
+        <w:rPr>
+          <w:rFonts w:ascii="맑은 고딕" w:hAnsi="맑은 고딕" w:eastAsia="맑은 고딕" w:cs="맑은 고딕"/>
+          <w:b w:val="0"/>
+          <w:sz w:val="21"/>
+        </w:rPr>
+        <w:t>대사 수는 이렇게 줄여 주세요.</w:t>
+      </w:r>
+    </w:p>
+    <w:p>
+      <w:pPr>
+        <w:pStyle w:val="ListBullet"/>
+        <w:keepNext w:val="0"/>
+        <w:spacing w:after="60" w:before="0" w:line="336" w:lineRule="auto"/>
+      </w:pPr>
+      <w:r>
+        <w:rPr>
+          <w:rFonts w:ascii="맑은 고딕" w:hAnsi="맑은 고딕" w:eastAsia="맑은 고딕" w:cs="맑은 고딕"/>
+          <w:b w:val="0"/>
+          <w:sz w:val="21"/>
+        </w:rPr>
+        <w:t>단역 대사를 절반으로 줄여 주세요. 13화 집사와 하녀장, 15화와 34~35화 귀족들의 뒷말, 20~21화 성기사, 28화 황제 연설이 그렇습니다.</w:t>
+      </w:r>
+    </w:p>
+    <w:p>
+      <w:pPr>
+        <w:pStyle w:val="ListBullet"/>
+        <w:keepNext w:val="0"/>
+        <w:spacing w:after="60" w:before="0" w:line="336" w:lineRule="auto"/>
+      </w:pPr>
+      <w:r>
+        <w:rPr>
+          <w:rFonts w:ascii="맑은 고딕" w:hAnsi="맑은 고딕" w:eastAsia="맑은 고딕" w:cs="맑은 고딕"/>
+          <w:b w:val="0"/>
+          <w:sz w:val="21"/>
+        </w:rPr>
+        <w:t>말없이 놀라는 「…!」 대사 22개는 지문으로 옮겨 주세요.</w:t>
+      </w:r>
+    </w:p>
+    <w:p>
+      <w:pPr>
+        <w:pStyle w:val="ListBullet"/>
+        <w:keepNext w:val="0"/>
+        <w:spacing w:after="60" w:before="0" w:line="336" w:lineRule="auto"/>
+      </w:pPr>
+      <w:r>
+        <w:rPr>
+          <w:rFonts w:ascii="맑은 고딕" w:hAnsi="맑은 고딕" w:eastAsia="맑은 고딕" w:cs="맑은 고딕"/>
+          <w:b w:val="0"/>
+          <w:sz w:val="21"/>
+        </w:rPr>
+        <w:t>엘리의 속마음 대사가 85개입니다. 화면에 이미 보이는 것을 다시 말하는 줄은 빼 주세요.</w:t>
+      </w:r>
+    </w:p>
+    <w:p>
+      <w:pPr>
+        <w:keepNext w:val="0"/>
+        <w:spacing w:after="120" w:before="0" w:line="348" w:lineRule="auto"/>
+      </w:pPr>
+      <w:r>
+        <w:rPr>
+          <w:rFonts w:ascii="맑은 고딕" w:hAnsi="맑은 고딕" w:eastAsia="맑은 고딕" w:cs="맑은 고딕"/>
+          <w:b w:val="0"/>
+          <w:sz w:val="21"/>
+        </w:rPr>
+        <w:t>더 줄여야 하면 이 장면들을 빼셔도 됩니다. 12~14화 연회 전 장면, 23·24화에 연달아 나오는 정사 중 하나, 36화 빗속 말타기, 49화 집무실 책상 정사(11화와 같은 장면)입니다.</w:t>
+      </w:r>
+    </w:p>
+    <w:p>
+      <w:pPr>
+        <w:pStyle w:val="Heading3"/>
+        <w:keepNext/>
+        <w:spacing w:before="200" w:after="60"/>
+      </w:pPr>
+      <w:r>
+        <w:rPr>
+          <w:rFonts w:ascii="맑은 고딕" w:hAnsi="맑은 고딕" w:eastAsia="맑은 고딕" w:cs="맑은 고딕"/>
+          <w:b/>
+          <w:color w:val="1F3A5F"/>
+          <w:sz w:val="23"/>
+        </w:rPr>
+        <w:t>② 악역은 단순하게 써 주세요</w:t>
+      </w:r>
+    </w:p>
+    <w:p>
+      <w:pPr>
+        <w:keepNext w:val="0"/>
+        <w:spacing w:after="120" w:before="0" w:line="348" w:lineRule="auto"/>
+      </w:pPr>
+      <w:r>
+        <w:rPr>
+          <w:rFonts w:ascii="맑은 고딕" w:hAnsi="맑은 고딕" w:eastAsia="맑은 고딕" w:cs="맑은 고딕"/>
+          <w:b w:val="0"/>
+          <w:sz w:val="21"/>
+        </w:rPr>
+        <w:t>지금은 악역이 많고 계획이 복잡합니다. 로젤린, 네이슨, 비비안, 흑마법사, 황제가 각자 계획을 세웁니다. 약물 잔(16화), 성기사 누명(20화), 비비안을 풀어 엘리를 죽이게 하고 폭주 약을 쓰는 계획(26~29화), 흑마법 제물 납치(38~40화), 괴수 소환(45~47화)이 이어집니다.</w:t>
+      </w:r>
+    </w:p>
+    <w:p>
+      <w:pPr>
+        <w:pStyle w:val="ListBullet"/>
+        <w:keepNext w:val="0"/>
+        <w:spacing w:after="60" w:before="0" w:line="336" w:lineRule="auto"/>
+      </w:pPr>
+      <w:r>
+        <w:rPr>
+          <w:rFonts w:ascii="맑은 고딕" w:hAnsi="맑은 고딕" w:eastAsia="맑은 고딕" w:cs="맑은 고딕"/>
+          <w:b w:val="0"/>
+          <w:sz w:val="21"/>
+        </w:rPr>
+        <w:t>악역은 로젤린과 네이슨 둘이면 충분합니다. 로젤린은 킬리언을 갖고 싶어서 엘리를 가짜로 몰려고 합니다. 네이슨은 킬리언을 끌어내리려고 합니다. 비비안은 이 둘의 손발로 씁니다.</w:t>
+      </w:r>
+    </w:p>
+    <w:p>
+      <w:pPr>
+        <w:pStyle w:val="ListBullet"/>
+        <w:keepNext w:val="0"/>
+        <w:spacing w:after="60" w:before="0" w:line="336" w:lineRule="auto"/>
+      </w:pPr>
+      <w:r>
+        <w:rPr>
+          <w:rFonts w:ascii="맑은 고딕" w:hAnsi="맑은 고딕" w:eastAsia="맑은 고딕" w:cs="맑은 고딕"/>
+          <w:b w:val="0"/>
+          <w:sz w:val="21"/>
+        </w:rPr>
+        <w:t>흑마법사와 황제는 41화에 엘리가 아는 비밀, 즉 킬리언의 아버지를 죽인 저주가 황제와 흑마법사의 짓이라는 사실로만 써도 충분합니다.</w:t>
+      </w:r>
+    </w:p>
+    <w:p>
+      <w:pPr>
+        <w:pStyle w:val="ListBullet"/>
+        <w:keepNext w:val="0"/>
+        <w:spacing w:after="60" w:before="0" w:line="336" w:lineRule="auto"/>
+      </w:pPr>
+      <w:r>
+        <w:rPr>
+          <w:rFonts w:ascii="맑은 고딕" w:hAnsi="맑은 고딕" w:eastAsia="맑은 고딕" w:cs="맑은 고딕"/>
+          <w:b w:val="0"/>
+          <w:sz w:val="21"/>
+        </w:rPr>
+        <w:t>악역의 계획은 시청자가 한 번에 알아듣게 한 줄로 해 주세요. 엘리는 원작에서 봐서 그 계획을 미리 압니다.</w:t>
+      </w:r>
+    </w:p>
+    <w:p>
+      <w:pPr>
+        <w:pStyle w:val="ListBullet"/>
+        <w:keepNext w:val="0"/>
+        <w:spacing w:after="60" w:before="0" w:line="336" w:lineRule="auto"/>
+      </w:pPr>
+      <w:r>
+        <w:rPr>
+          <w:rFonts w:ascii="맑은 고딕" w:hAnsi="맑은 고딕" w:eastAsia="맑은 고딕" w:cs="맑은 고딕"/>
+          <w:b w:val="0"/>
+          <w:sz w:val="21"/>
+        </w:rPr>
+        <w:t>악역은 자기 꾀에 자기가 걸려서 사람들 앞에서 바보가 됩니다. 16~18화가 본보기입니다. 네이슨은 자기 손으로 약 탄 잔을 도로 가져가고, 그 잔을 비비안이 마시고, 비비안이 사람들 앞에서 네이슨의 뺨을 때립니다.</w:t>
+      </w:r>
+    </w:p>
+    <w:p>
+      <w:pPr>
+        <w:pStyle w:val="Heading3"/>
+        <w:keepNext/>
+        <w:spacing w:before="200" w:after="60"/>
+      </w:pPr>
+      <w:r>
+        <w:rPr>
+          <w:rFonts w:ascii="맑은 고딕" w:hAnsi="맑은 고딕" w:eastAsia="맑은 고딕" w:cs="맑은 고딕"/>
+          <w:b/>
+          <w:color w:val="1F3A5F"/>
+          <w:sz w:val="23"/>
+        </w:rPr>
+        <w:t>③ 엘리는 억울하게 몰려도 자기 힘으로 뚫고 인정받습니다</w:t>
+      </w:r>
+    </w:p>
+    <w:p>
+      <w:pPr>
+        <w:keepNext w:val="0"/>
+        <w:spacing w:after="120" w:before="0" w:line="348" w:lineRule="auto"/>
+      </w:pPr>
+      <w:r>
+        <w:rPr>
+          <w:rFonts w:ascii="맑은 고딕" w:hAnsi="맑은 고딕" w:eastAsia="맑은 고딕" w:cs="맑은 고딕"/>
+          <w:b w:val="0"/>
+          <w:sz w:val="21"/>
+        </w:rPr>
+        <w:t>위기는 있어도 됩니다. 다만 매번 같은 순서로 가 주세요. 엘리가 억울하게 몰립니다. 엘리가 당당하게 받아칩니다. 엘리가 자기가 옳다는 걸 사람들 앞에서 증명합니다. 사람들이 엘리를 다시 보고, 악역만 바보가 됩니다.</w:t>
+      </w:r>
+    </w:p>
+    <w:p>
+      <w:pPr>
+        <w:keepNext w:val="0"/>
+        <w:spacing w:after="120" w:before="0" w:line="348" w:lineRule="auto"/>
+      </w:pPr>
+      <w:r>
+        <w:rPr>
+          <w:rFonts w:ascii="맑은 고딕" w:hAnsi="맑은 고딕" w:eastAsia="맑은 고딕" w:cs="맑은 고딕"/>
+          <w:b w:val="0"/>
+          <w:sz w:val="21"/>
+        </w:rPr>
+        <w:t>이미 이렇게 된 장면은 3화 협상, 16~18화 약물 잔, 28화 「귀족의 전통이 그렇게 대단한 거라면, 성녀님이나 많이 지키세요.」, 42화 엘리가 네이슨에게 발을 거는 장면입니다.</w:t>
+      </w:r>
+    </w:p>
+    <w:p>
+      <w:pPr>
+        <w:keepNext w:val="0"/>
+        <w:spacing w:after="120" w:before="0" w:line="348" w:lineRule="auto"/>
+      </w:pPr>
+      <w:r>
+        <w:rPr>
+          <w:rFonts w:ascii="맑은 고딕" w:hAnsi="맑은 고딕" w:eastAsia="맑은 고딕" w:cs="맑은 고딕"/>
+          <w:b w:val="0"/>
+          <w:sz w:val="21"/>
+        </w:rPr>
+        <w:t>아래 장면들은 엘리가 직접 뚫지 않고, 누가 구해 주거나 받은 힘으로 빠져나옵니다. 엘리가 자기 힘으로 뚫는 장면으로 바꿔 주세요.</w:t>
+      </w:r>
+    </w:p>
+    <w:p>
+      <w:pPr>
+        <w:pStyle w:val="ListBullet"/>
+        <w:keepNext w:val="0"/>
+        <w:spacing w:after="60" w:before="0" w:line="336" w:lineRule="auto"/>
+      </w:pPr>
+      <w:r>
+        <w:rPr>
+          <w:rFonts w:ascii="맑은 고딕" w:hAnsi="맑은 고딕" w:eastAsia="맑은 고딕" w:cs="맑은 고딕"/>
+          <w:b w:val="0"/>
+          <w:sz w:val="21"/>
+        </w:rPr>
+        <w:t>19화: 로젤린이 「있어야 할 자리를 착각하고 있는 거 아닌가요?」라고 하자 엘리가 고개를 숙이고, 킬리언이 막아 줍니다.</w:t>
+      </w:r>
+    </w:p>
+    <w:p>
+      <w:pPr>
+        <w:pStyle w:val="ListBullet"/>
+        <w:keepNext w:val="0"/>
+        <w:spacing w:after="60" w:before="0" w:line="336" w:lineRule="auto"/>
+      </w:pPr>
+      <w:r>
+        <w:rPr>
+          <w:rFonts w:ascii="맑은 고딕" w:hAnsi="맑은 고딕" w:eastAsia="맑은 고딕" w:cs="맑은 고딕"/>
+          <w:b w:val="0"/>
+          <w:sz w:val="21"/>
+        </w:rPr>
+        <w:t>20~21화: 성기사들이 엘리에게 누명을 씌우고, 카엘이 구해 줍니다.</w:t>
+      </w:r>
+    </w:p>
+    <w:p>
+      <w:pPr>
+        <w:pStyle w:val="ListBullet"/>
+        <w:keepNext w:val="0"/>
+        <w:spacing w:after="60" w:before="0" w:line="336" w:lineRule="auto"/>
+      </w:pPr>
+      <w:r>
+        <w:rPr>
+          <w:rFonts w:ascii="맑은 고딕" w:hAnsi="맑은 고딕" w:eastAsia="맑은 고딕" w:cs="맑은 고딕"/>
+          <w:b w:val="0"/>
+          <w:sz w:val="21"/>
+        </w:rPr>
+        <w:t>29화: 비비안이 독칼을 들고, 킬리언이 구해 줍니다.</w:t>
+      </w:r>
+    </w:p>
+    <w:p>
+      <w:pPr>
+        <w:pStyle w:val="ListBullet"/>
+        <w:keepNext w:val="0"/>
+        <w:spacing w:after="60" w:before="0" w:line="336" w:lineRule="auto"/>
+      </w:pPr>
+      <w:r>
+        <w:rPr>
+          <w:rFonts w:ascii="맑은 고딕" w:hAnsi="맑은 고딕" w:eastAsia="맑은 고딕" w:cs="맑은 고딕"/>
+          <w:b w:val="0"/>
+          <w:sz w:val="21"/>
+        </w:rPr>
+        <w:t>38~40화: 엘리가 납치되고, 신에게 빌어서 사슬이 풀립니다.</w:t>
+      </w:r>
+    </w:p>
+    <w:p>
+      <w:pPr>
+        <w:pStyle w:val="ListBullet"/>
+        <w:keepNext w:val="0"/>
+        <w:spacing w:after="60" w:before="0" w:line="336" w:lineRule="auto"/>
+      </w:pPr>
+      <w:r>
+        <w:rPr>
+          <w:rFonts w:ascii="맑은 고딕" w:hAnsi="맑은 고딕" w:eastAsia="맑은 고딕" w:cs="맑은 고딕"/>
+          <w:b w:val="0"/>
+          <w:sz w:val="21"/>
+        </w:rPr>
+        <w:t>44화: 엘리가 「정말… 저도 가면 안 돼요…?」 하고 성에 남습니다.</w:t>
+      </w:r>
+    </w:p>
+    <w:p>
+      <w:pPr>
+        <w:pStyle w:val="ListBullet"/>
+        <w:keepNext w:val="0"/>
+        <w:spacing w:after="60" w:before="0" w:line="336" w:lineRule="auto"/>
+      </w:pPr>
+      <w:r>
+        <w:rPr>
+          <w:rFonts w:ascii="맑은 고딕" w:hAnsi="맑은 고딕" w:eastAsia="맑은 고딕" w:cs="맑은 고딕"/>
+          <w:b w:val="0"/>
+          <w:sz w:val="21"/>
+        </w:rPr>
+        <w:t>47화: 신이 준 「주인공 버프」로 이깁니다.</w:t>
+      </w:r>
+    </w:p>
+    <w:p>
+      <w:pPr>
+        <w:keepNext w:val="0"/>
+        <w:spacing w:after="120" w:before="0" w:line="348" w:lineRule="auto"/>
+      </w:pPr>
+      <w:r>
+        <w:rPr>
+          <w:rFonts w:ascii="맑은 고딕" w:hAnsi="맑은 고딕" w:eastAsia="맑은 고딕" w:cs="맑은 고딕"/>
+          <w:b w:val="0"/>
+          <w:sz w:val="21"/>
+        </w:rPr>
+        <w:t>25화 「아마 이제 내가 예측할 수 없는 방향으로 사건이 흐르겠지.」는 빼 주세요. 이 대사 뒤로는 엘리가 원작을 모르는 사람이 됩니다. 엘리가 원작을 아는 것은 끝까지 엘리의 무기입니다.</w:t>
+      </w:r>
+    </w:p>
+    <w:p>
+      <w:pPr>
+        <w:keepNext w:val="0"/>
+        <w:spacing w:after="120" w:before="0" w:line="348" w:lineRule="auto"/>
+      </w:pPr>
+      <w:r>
+        <w:rPr>
+          <w:rFonts w:ascii="맑은 고딕" w:hAnsi="맑은 고딕" w:eastAsia="맑은 고딕" w:cs="맑은 고딕"/>
+          <w:b w:val="0"/>
+          <w:sz w:val="21"/>
+        </w:rPr>
+        <w:t>마지막도 엘리가 끝냅니다. 41화의 비밀을 엘리가 궁정 사람들 앞에서 밝히고, 사람들이 엘리를 성녀로 부르며 끝납니다. 48화 「킬리언 황제 전하 만세! 성녀 전하 만세!」가 이미 있습니다. 로젤린이 가졌던 성녀 자리가 사람들 앞에서 엘리에게 넘어가는 장면이 되게 해 주세요.</w:t>
+      </w:r>
+    </w:p>
+    <w:p>
+      <w:pPr>
+        <w:pStyle w:val="Heading3"/>
+        <w:keepNext/>
+        <w:spacing w:before="200" w:after="60"/>
+      </w:pPr>
+      <w:r>
+        <w:rPr>
+          <w:rFonts w:ascii="맑은 고딕" w:hAnsi="맑은 고딕" w:eastAsia="맑은 고딕" w:cs="맑은 고딕"/>
+          <w:b/>
+          <w:color w:val="1F3A5F"/>
+          <w:sz w:val="23"/>
+        </w:rPr>
+        <w:t>④ 로맨스는 끝까지 둘 사이로만 갑니다</w:t>
+      </w:r>
+    </w:p>
+    <w:p>
+      <w:pPr>
+        <w:pStyle w:val="ListBullet"/>
+        <w:keepNext w:val="0"/>
+        <w:spacing w:after="60" w:before="0" w:line="336" w:lineRule="auto"/>
+      </w:pPr>
+      <w:r>
+        <w:rPr>
+          <w:rFonts w:ascii="맑은 고딕" w:hAnsi="맑은 고딕" w:eastAsia="맑은 고딕" w:cs="맑은 고딕"/>
+          <w:b w:val="0"/>
+          <w:sz w:val="21"/>
+        </w:rPr>
+        <w:t>엘리가 한 번 이길 때마다 킬리언이 엘리에게 더 빠집니다. 18화 킬리언 「고맙군. 그대 덕분에 황궁에서 처음으로 웃었어.」가 본보기입니다.</w:t>
+      </w:r>
+    </w:p>
+    <w:p>
+      <w:pPr>
+        <w:pStyle w:val="ListBullet"/>
+        <w:keepNext w:val="0"/>
+        <w:spacing w:after="60" w:before="0" w:line="336" w:lineRule="auto"/>
+      </w:pPr>
+      <w:r>
+        <w:rPr>
+          <w:rFonts w:ascii="맑은 고딕" w:hAnsi="맑은 고딕" w:eastAsia="맑은 고딕" w:cs="맑은 고딕"/>
+          <w:b w:val="0"/>
+          <w:sz w:val="21"/>
+        </w:rPr>
+        <w:t>저주가 풀리는 정도를 둘의 사랑과 같이 올려 주세요. 처음엔 키스로 잠깐 멈추고, 갈수록 더 풀리고, 마지막에 완전히 풀립니다. 지금 원고에는 완전히 풀리는 순간이 없고, 44화에 킬리언이 「내 저주는 이미 너로 인해 풀렸으니까.」라고 말하며 지나갑니다. 2화에서 정한 대로라면, 이 장면을 보고 시청자는 두 사람이 진짜로 사랑한다는 걸 압니다. 검은 마력이 완전히 걷히는 순간을 한 장면으로 보여 주세요.</w:t>
+      </w:r>
+    </w:p>
+    <w:p>
+      <w:pPr>
+        <w:pStyle w:val="ListBullet"/>
+        <w:keepNext w:val="0"/>
+        <w:spacing w:after="60" w:before="0" w:line="336" w:lineRule="auto"/>
+      </w:pPr>
+      <w:r>
+        <w:rPr>
+          <w:rFonts w:ascii="맑은 고딕" w:hAnsi="맑은 고딕" w:eastAsia="맑은 고딕" w:cs="맑은 고딕"/>
+          <w:b w:val="0"/>
+          <w:sz w:val="21"/>
+        </w:rPr>
+        <w:t>카엘은 엘리에게 반해서 킬리언을 질투하게 만드는 사람까지만 써 주세요. 엘리는 카엘에게 흔들리지 않습니다. 21~23화에 킬리언이 질투하다가 마차 장면으로 가는 흐름은 좋습니다.</w:t>
+      </w:r>
+    </w:p>
+    <w:p>
+      <w:pPr>
+        <w:pStyle w:val="ListBullet"/>
+        <w:keepNext w:val="0"/>
+        <w:spacing w:after="60" w:before="0" w:line="336" w:lineRule="auto"/>
+      </w:pPr>
+      <w:r>
+        <w:rPr>
+          <w:rFonts w:ascii="맑은 고딕" w:hAnsi="맑은 고딕" w:eastAsia="맑은 고딕" w:cs="맑은 고딕"/>
+          <w:b w:val="0"/>
+          <w:sz w:val="21"/>
+        </w:rPr>
+        <w:t>정사 장면은 붙여 쓰지 말고 사이사이에 넣어 주세요. 지금은 23·24화에 연달아 나오고, 32~33화 오두막과 37화 숲속에 바깥 정사가 두 번 나옵니다.</w:t>
       </w:r>
     </w:p>
     <w:p>
@@ -418,114 +805,7 @@
           <w:color w:val="1F3A5F"/>
           <w:sz w:val="26"/>
         </w:rPr>
-        <w:t>3. 작가님이 정하실 것 (꼭 바꾸지 않아도 됩니다)</w:t>
-      </w:r>
-    </w:p>
-    <w:p>
-      <w:pPr>
-        <w:pStyle w:val="ListBullet"/>
-        <w:keepNext w:val="0"/>
-        <w:spacing w:after="60" w:before="0" w:line="336" w:lineRule="auto"/>
-      </w:pPr>
-      <w:r>
-        <w:rPr>
-          <w:rFonts w:ascii="맑은 고딕" w:hAnsi="맑은 고딕" w:eastAsia="맑은 고딕" w:cs="맑은 고딕"/>
-          <w:b w:val="0"/>
-          <w:sz w:val="21"/>
-        </w:rPr>
-        <w:t>43~48화의 기사단 진격, 황좌 탈환, 괴수 싸움을 얼마나 크게 할지 정해 주세요. ②번대로 엘리가 결말을 내게 되면, 거기에 맞춰 줄이셔도 되고 그대로 두셔도 됩니다.</w:t>
-      </w:r>
-    </w:p>
-    <w:p>
-      <w:pPr>
-        <w:pStyle w:val="ListBullet"/>
-        <w:keepNext w:val="0"/>
-        <w:spacing w:after="60" w:before="0" w:line="336" w:lineRule="auto"/>
-      </w:pPr>
-      <w:r>
-        <w:rPr>
-          <w:rFonts w:ascii="맑은 고딕" w:hAnsi="맑은 고딕" w:eastAsia="맑은 고딕" w:cs="맑은 고딕"/>
-          <w:b w:val="0"/>
-          <w:sz w:val="21"/>
-        </w:rPr>
-        <w:t>사냥대회, 가면무도회 같은 행사 장면을 몇 개 남길지 정해 주세요.</w:t>
-      </w:r>
-    </w:p>
-    <w:p>
-      <w:pPr>
-        <w:pStyle w:val="ListBullet"/>
-        <w:keepNext w:val="0"/>
-        <w:spacing w:after="60" w:before="0" w:line="336" w:lineRule="auto"/>
-      </w:pPr>
-      <w:r>
-        <w:rPr>
-          <w:rFonts w:ascii="맑은 고딕" w:hAnsi="맑은 고딕" w:eastAsia="맑은 고딕" w:cs="맑은 고딕"/>
-          <w:b w:val="0"/>
-          <w:sz w:val="21"/>
-        </w:rPr>
-        <w:t>지금 원고는 약 75분으로 분량 기준 안에 있습니다. 분량을 줄이시라는 요청은 아닙니다.</w:t>
-      </w:r>
-    </w:p>
-    <w:p>
-      <w:pPr>
-        <w:pStyle w:val="Heading2"/>
-        <w:keepNext/>
-        <w:spacing w:before="320" w:after="80"/>
-      </w:pPr>
-      <w:r>
-        <w:rPr>
-          <w:rFonts w:ascii="맑은 고딕" w:hAnsi="맑은 고딕" w:eastAsia="맑은 고딕" w:cs="맑은 고딕"/>
-          <w:b/>
-          <w:color w:val="1F3A5F"/>
-          <w:sz w:val="26"/>
-        </w:rPr>
-        <w:t>4. 여쭤볼 것</w:t>
-      </w:r>
-    </w:p>
-    <w:p>
-      <w:pPr>
-        <w:pStyle w:val="ListBullet"/>
-        <w:keepNext w:val="0"/>
-        <w:spacing w:after="60" w:before="0" w:line="336" w:lineRule="auto"/>
-      </w:pPr>
-      <w:r>
-        <w:rPr>
-          <w:rFonts w:ascii="맑은 고딕" w:hAnsi="맑은 고딕" w:eastAsia="맑은 고딕" w:cs="맑은 고딕"/>
-          <w:b w:val="0"/>
-          <w:sz w:val="21"/>
-        </w:rPr>
-        <w:t>저주는 키스로 잠깐 멈추는 것과 완전히 풀리는 것 사이에 어떤 단계가 있나요? 5화에서 이미 정사까지 가는데, 유료에서 치료가 갈수록 무엇이 달라지는지 정리해 주세요.</w:t>
-      </w:r>
-    </w:p>
-    <w:p>
-      <w:pPr>
-        <w:pStyle w:val="ListBullet"/>
-        <w:keepNext w:val="0"/>
-        <w:spacing w:after="60" w:before="0" w:line="336" w:lineRule="auto"/>
-      </w:pPr>
-      <w:r>
-        <w:rPr>
-          <w:rFonts w:ascii="맑은 고딕" w:hAnsi="맑은 고딕" w:eastAsia="맑은 고딕" w:cs="맑은 고딕"/>
-          <w:b w:val="0"/>
-          <w:sz w:val="21"/>
-        </w:rPr>
-        <w:t>카엘(원작 남주, 20화 등장)은 계속 나오나요? 러프 기획안에는 없습니다. 계속 나온다면 엘리에게 반해서 킬리언을 질투하게 만드는 사람으로 써 주세요. 21~23화에 킬리언이 질투하다가 마차 장면으로 가는 흐름이 좋습니다.</w:t>
-      </w:r>
-    </w:p>
-    <w:p>
-      <w:pPr>
-        <w:pStyle w:val="Heading2"/>
-        <w:keepNext/>
-        <w:spacing w:before="320" w:after="80"/>
-      </w:pPr>
-      <w:r>
-        <w:rPr>
-          <w:rFonts w:ascii="맑은 고딕" w:hAnsi="맑은 고딕" w:eastAsia="맑은 고딕" w:cs="맑은 고딕"/>
-          <w:b/>
-          <w:color w:val="1F3A5F"/>
-          <w:sz w:val="26"/>
-        </w:rPr>
-        <w:t>5. 다음에 받을 것</w:t>
+        <w:t>4. 다음에 받을 것</w:t>
       </w:r>
     </w:p>
     <w:p>

</xml_diff>